<commit_message>
Correciones TP3, MontañaComo OIA
</commit_message>
<xml_diff>
--- a/Trabajos Prácticos/TP3/Complejidad Computacional.docx
+++ b/Trabajos Prácticos/TP3/Complejidad Computacional.docx
@@ -1,6 +1,6 @@
 
 <file path=word/document.xml><?xml version="1.0" encoding="utf-8"?>
-<w:document xmlns:wpc="http://schemas.microsoft.com/office/word/2010/wordprocessingCanvas" xmlns:cx="http://schemas.microsoft.com/office/drawing/2014/chartex" xmlns:cx1="http://schemas.microsoft.com/office/drawing/2015/9/8/chartex" xmlns:mc="http://schemas.openxmlformats.org/markup-compatibility/2006" xmlns:o="urn:schemas-microsoft-com:office:office" xmlns:r="http://schemas.openxmlformats.org/officeDocument/2006/relationships" xmlns:m="http://schemas.openxmlformats.org/officeDocument/2006/math" xmlns:v="urn:schemas-microsoft-com:vml" xmlns:wp14="http://schemas.microsoft.com/office/word/2010/wordprocessingDrawing" xmlns:wp="http://schemas.openxmlformats.org/drawingml/2006/wordprocessingDrawing" xmlns:w10="urn:schemas-microsoft-com:office:word" xmlns:w="http://schemas.openxmlformats.org/wordprocessingml/2006/main" xmlns:w14="http://schemas.microsoft.com/office/word/2010/wordml" xmlns:w15="http://schemas.microsoft.com/office/word/2012/wordml" xmlns:w16se="http://schemas.microsoft.com/office/word/2015/wordml/symex" xmlns:wpg="http://schemas.microsoft.com/office/word/2010/wordprocessingGroup" xmlns:wpi="http://schemas.microsoft.com/office/word/2010/wordprocessingInk" xmlns:wne="http://schemas.microsoft.com/office/word/2006/wordml" xmlns:wps="http://schemas.microsoft.com/office/word/2010/wordprocessingShape" mc:Ignorable="w14 w15 w16se wp14">
+<w:document xmlns:wpc="http://schemas.microsoft.com/office/word/2010/wordprocessingCanvas" xmlns:cx="http://schemas.microsoft.com/office/drawing/2014/chartex" xmlns:mc="http://schemas.openxmlformats.org/markup-compatibility/2006" xmlns:o="urn:schemas-microsoft-com:office:office" xmlns:r="http://schemas.openxmlformats.org/officeDocument/2006/relationships" xmlns:m="http://schemas.openxmlformats.org/officeDocument/2006/math" xmlns:v="urn:schemas-microsoft-com:vml" xmlns:wp14="http://schemas.microsoft.com/office/word/2010/wordprocessingDrawing" xmlns:wp="http://schemas.openxmlformats.org/drawingml/2006/wordprocessingDrawing" xmlns:w10="urn:schemas-microsoft-com:office:word" xmlns:w="http://schemas.openxmlformats.org/wordprocessingml/2006/main" xmlns:w14="http://schemas.microsoft.com/office/word/2010/wordml" xmlns:w15="http://schemas.microsoft.com/office/word/2012/wordml" xmlns:w16se="http://schemas.microsoft.com/office/word/2015/wordml/symex" xmlns:wpg="http://schemas.microsoft.com/office/word/2010/wordprocessingGroup" xmlns:wpi="http://schemas.microsoft.com/office/word/2010/wordprocessingInk" xmlns:wne="http://schemas.microsoft.com/office/word/2006/wordml" xmlns:wps="http://schemas.microsoft.com/office/word/2010/wordprocessingShape" mc:Ignorable="w14 w15 w16se wp14">
   <w:body>
     <w:p>
       <w:pPr>
@@ -192,147 +192,20 @@
         <w:rPr>
           <w:rFonts w:ascii="Arial" w:hAnsi="Arial" w:cs="Arial"/>
         </w:rPr>
-        <w:t>Evaluar Recursiva: O(N)</w:t>
-      </w:r>
-    </w:p>
-    <w:p>
-      <w:pPr>
-        <w:rPr>
-          <w:rFonts w:ascii="Arial" w:hAnsi="Arial" w:cs="Arial"/>
-        </w:rPr>
-      </w:pPr>
-      <w:proofErr w:type="spellStart"/>
-      <w:r>
-        <w:rPr>
-          <w:rFonts w:ascii="Arial" w:hAnsi="Arial" w:cs="Arial"/>
-        </w:rPr>
-        <w:t>PotenciaRecursiva</w:t>
-      </w:r>
-      <w:proofErr w:type="spellEnd"/>
-      <w:r>
-        <w:rPr>
-          <w:rFonts w:ascii="Arial" w:hAnsi="Arial" w:cs="Arial"/>
-        </w:rPr>
-        <w:t>: O(N)</w:t>
-      </w:r>
-    </w:p>
-    <w:p>
-      <w:pPr>
-        <w:rPr>
-          <w:rFonts w:ascii="Arial" w:hAnsi="Arial" w:cs="Arial"/>
-        </w:rPr>
-      </w:pPr>
-      <w:r>
-        <w:rPr>
-          <w:rFonts w:ascii="Arial" w:hAnsi="Arial" w:cs="Arial"/>
-        </w:rPr>
-        <w:t>2.1.2.B</w:t>
-      </w:r>
-    </w:p>
-    <w:p>
-      <w:pPr>
-        <w:rPr>
-          <w:rFonts w:ascii="Arial" w:hAnsi="Arial" w:cs="Arial"/>
-        </w:rPr>
-      </w:pPr>
-      <w:r>
-        <w:rPr>
-          <w:rFonts w:ascii="Arial" w:hAnsi="Arial" w:cs="Arial"/>
-        </w:rPr>
-        <w:t xml:space="preserve">Evaluar </w:t>
-      </w:r>
-      <w:proofErr w:type="spellStart"/>
-      <w:r>
-        <w:rPr>
-          <w:rFonts w:ascii="Arial" w:hAnsi="Arial" w:cs="Arial"/>
-        </w:rPr>
-        <w:t>RecursivaPar</w:t>
-      </w:r>
-      <w:proofErr w:type="spellEnd"/>
-      <w:r>
-        <w:rPr>
-          <w:rFonts w:ascii="Arial" w:hAnsi="Arial" w:cs="Arial"/>
-        </w:rPr>
-        <w:t>: O(N</w:t>
-      </w:r>
-      <w:r>
-        <w:rPr>
-          <w:rFonts w:ascii="Arial" w:hAnsi="Arial" w:cs="Arial"/>
-        </w:rPr>
-        <w:t>*log(N)</w:t>
-      </w:r>
-      <w:r>
-        <w:rPr>
-          <w:rFonts w:ascii="Arial" w:hAnsi="Arial" w:cs="Arial"/>
-        </w:rPr>
-        <w:t>)</w:t>
-      </w:r>
-    </w:p>
-    <w:p>
-      <w:pPr>
-        <w:rPr>
-          <w:rFonts w:ascii="Arial" w:hAnsi="Arial" w:cs="Arial"/>
-        </w:rPr>
-      </w:pPr>
-      <w:proofErr w:type="spellStart"/>
-      <w:r>
-        <w:rPr>
-          <w:rFonts w:ascii="Arial" w:hAnsi="Arial" w:cs="Arial"/>
-        </w:rPr>
-        <w:t>PotenciaRecursivaPar</w:t>
-      </w:r>
-      <w:proofErr w:type="spellEnd"/>
-      <w:r>
-        <w:rPr>
-          <w:rFonts w:ascii="Arial" w:hAnsi="Arial" w:cs="Arial"/>
-        </w:rPr>
-        <w:t>: O(log(N))</w:t>
-      </w:r>
-    </w:p>
-    <w:p>
-      <w:pPr>
-        <w:rPr>
-          <w:rFonts w:ascii="Arial" w:hAnsi="Arial" w:cs="Arial"/>
-        </w:rPr>
-      </w:pPr>
-      <w:r>
-        <w:rPr>
-          <w:rFonts w:ascii="Arial" w:hAnsi="Arial" w:cs="Arial"/>
-        </w:rPr>
-        <w:t>2.1.3</w:t>
-      </w:r>
-    </w:p>
-    <w:p>
-      <w:pPr>
-        <w:rPr>
-          <w:rFonts w:ascii="Arial" w:hAnsi="Arial" w:cs="Arial"/>
-        </w:rPr>
-      </w:pPr>
-      <w:r>
-        <w:rPr>
-          <w:rFonts w:ascii="Arial" w:hAnsi="Arial" w:cs="Arial"/>
-        </w:rPr>
-        <w:t xml:space="preserve">Evaluar </w:t>
-      </w:r>
-      <w:proofErr w:type="spellStart"/>
-      <w:r>
-        <w:rPr>
-          <w:rFonts w:ascii="Arial" w:hAnsi="Arial" w:cs="Arial"/>
-        </w:rPr>
-        <w:t>ProgDinamica</w:t>
-      </w:r>
-      <w:proofErr w:type="spellEnd"/>
-      <w:r>
-        <w:rPr>
-          <w:rFonts w:ascii="Arial" w:hAnsi="Arial" w:cs="Arial"/>
-        </w:rPr>
-        <w:t>: O(N)</w:t>
-      </w:r>
-      <w:r>
-        <w:rPr>
-          <w:rFonts w:ascii="Arial" w:hAnsi="Arial" w:cs="Arial"/>
-        </w:rPr>
-        <w:br/>
+        <w:t xml:space="preserve">Evaluar Recursiva: </w:t>
+      </w:r>
+      <w:r>
+        <w:rPr>
+          <w:rFonts w:ascii="Arial" w:hAnsi="Arial" w:cs="Arial"/>
+        </w:rPr>
+        <w:t>Ver O(N</w:t>
+      </w:r>
+      <w:r>
+        <w:rPr>
+          <w:rFonts w:ascii="Arial" w:hAnsi="Arial" w:cs="Arial"/>
+          <w:vertAlign w:val="superscript"/>
+        </w:rPr>
+        <w:t>2</w:t>
       </w:r>
       <w:bookmarkStart w:id="0" w:name="_GoBack"/>
       <w:bookmarkEnd w:id="0"/>
@@ -340,6 +213,152 @@
         <w:rPr>
           <w:rFonts w:ascii="Arial" w:hAnsi="Arial" w:cs="Arial"/>
         </w:rPr>
+        <w:t>)</w:t>
+      </w:r>
+    </w:p>
+    <w:p>
+      <w:pPr>
+        <w:rPr>
+          <w:rFonts w:ascii="Arial" w:hAnsi="Arial" w:cs="Arial"/>
+        </w:rPr>
+      </w:pPr>
+      <w:proofErr w:type="spellStart"/>
+      <w:r>
+        <w:rPr>
+          <w:rFonts w:ascii="Arial" w:hAnsi="Arial" w:cs="Arial"/>
+        </w:rPr>
+        <w:t>PotenciaRecursiva</w:t>
+      </w:r>
+      <w:proofErr w:type="spellEnd"/>
+      <w:r>
+        <w:rPr>
+          <w:rFonts w:ascii="Arial" w:hAnsi="Arial" w:cs="Arial"/>
+        </w:rPr>
+        <w:t>: O(N)</w:t>
+      </w:r>
+    </w:p>
+    <w:p>
+      <w:pPr>
+        <w:rPr>
+          <w:rFonts w:ascii="Arial" w:hAnsi="Arial" w:cs="Arial"/>
+        </w:rPr>
+      </w:pPr>
+      <w:r>
+        <w:rPr>
+          <w:rFonts w:ascii="Arial" w:hAnsi="Arial" w:cs="Arial"/>
+        </w:rPr>
+        <w:t>2.1.2.B</w:t>
+      </w:r>
+    </w:p>
+    <w:p>
+      <w:pPr>
+        <w:rPr>
+          <w:rFonts w:ascii="Arial" w:hAnsi="Arial" w:cs="Arial"/>
+        </w:rPr>
+      </w:pPr>
+      <w:r>
+        <w:rPr>
+          <w:rFonts w:ascii="Arial" w:hAnsi="Arial" w:cs="Arial"/>
+        </w:rPr>
+        <w:t xml:space="preserve">Evaluar </w:t>
+      </w:r>
+      <w:proofErr w:type="spellStart"/>
+      <w:r>
+        <w:rPr>
+          <w:rFonts w:ascii="Arial" w:hAnsi="Arial" w:cs="Arial"/>
+        </w:rPr>
+        <w:t>RecursivaPar</w:t>
+      </w:r>
+      <w:proofErr w:type="spellEnd"/>
+      <w:r>
+        <w:rPr>
+          <w:rFonts w:ascii="Arial" w:hAnsi="Arial" w:cs="Arial"/>
+        </w:rPr>
+        <w:t>: O(N</w:t>
+      </w:r>
+      <w:r>
+        <w:rPr>
+          <w:rFonts w:ascii="Arial" w:hAnsi="Arial" w:cs="Arial"/>
+        </w:rPr>
+        <w:t>*log(N)</w:t>
+      </w:r>
+      <w:r>
+        <w:rPr>
+          <w:rFonts w:ascii="Arial" w:hAnsi="Arial" w:cs="Arial"/>
+        </w:rPr>
+        <w:t>)</w:t>
+      </w:r>
+    </w:p>
+    <w:p>
+      <w:pPr>
+        <w:rPr>
+          <w:rFonts w:ascii="Arial" w:hAnsi="Arial" w:cs="Arial"/>
+        </w:rPr>
+      </w:pPr>
+      <w:proofErr w:type="spellStart"/>
+      <w:r>
+        <w:rPr>
+          <w:rFonts w:ascii="Arial" w:hAnsi="Arial" w:cs="Arial"/>
+        </w:rPr>
+        <w:t>PotenciaRecursivaPar</w:t>
+      </w:r>
+      <w:proofErr w:type="spellEnd"/>
+      <w:r>
+        <w:rPr>
+          <w:rFonts w:ascii="Arial" w:hAnsi="Arial" w:cs="Arial"/>
+        </w:rPr>
+        <w:t>: O(log(N))</w:t>
+      </w:r>
+    </w:p>
+    <w:p>
+      <w:pPr>
+        <w:rPr>
+          <w:rFonts w:ascii="Arial" w:hAnsi="Arial" w:cs="Arial"/>
+        </w:rPr>
+      </w:pPr>
+      <w:r>
+        <w:rPr>
+          <w:rFonts w:ascii="Arial" w:hAnsi="Arial" w:cs="Arial"/>
+        </w:rPr>
+        <w:t>2.1.3</w:t>
+      </w:r>
+    </w:p>
+    <w:p>
+      <w:pPr>
+        <w:rPr>
+          <w:rFonts w:ascii="Arial" w:hAnsi="Arial" w:cs="Arial"/>
+        </w:rPr>
+      </w:pPr>
+      <w:r>
+        <w:rPr>
+          <w:rFonts w:ascii="Arial" w:hAnsi="Arial" w:cs="Arial"/>
+        </w:rPr>
+        <w:t xml:space="preserve">Evaluar </w:t>
+      </w:r>
+      <w:proofErr w:type="spellStart"/>
+      <w:r>
+        <w:rPr>
+          <w:rFonts w:ascii="Arial" w:hAnsi="Arial" w:cs="Arial"/>
+        </w:rPr>
+        <w:t>ProgDinamica</w:t>
+      </w:r>
+      <w:proofErr w:type="spellEnd"/>
+      <w:r>
+        <w:rPr>
+          <w:rFonts w:ascii="Arial" w:hAnsi="Arial" w:cs="Arial"/>
+        </w:rPr>
+        <w:t>: O(N)</w:t>
+      </w:r>
+      <w:r>
+        <w:rPr>
+          <w:rFonts w:ascii="Arial" w:hAnsi="Arial" w:cs="Arial"/>
+        </w:rPr>
+        <w:br/>
+      </w:r>
+      <w:r>
+        <w:rPr>
+          <w:rFonts w:ascii="Arial" w:hAnsi="Arial" w:cs="Arial"/>
+        </w:rPr>
         <w:br/>
       </w:r>
       <w:proofErr w:type="spellStart"/>
@@ -516,7 +535,25 @@
         <w:rPr>
           <w:rFonts w:ascii="Arial" w:hAnsi="Arial" w:cs="Arial"/>
         </w:rPr>
-        <w:t xml:space="preserve">2.2.1 Obtener coeficiente k: </w:t>
+        <w:t xml:space="preserve">2.2.1 </w:t>
+      </w:r>
+      <w:r>
+        <w:rPr>
+          <w:rFonts w:ascii="Arial" w:hAnsi="Arial" w:cs="Arial"/>
+        </w:rPr>
+        <w:t>H</w:t>
+      </w:r>
+      <w:r>
+        <w:rPr>
+          <w:rFonts w:ascii="Arial" w:hAnsi="Arial" w:cs="Arial"/>
+        </w:rPr>
+        <w:t>allar</w:t>
+      </w:r>
+      <w:r>
+        <w:rPr>
+          <w:rFonts w:ascii="Arial" w:hAnsi="Arial" w:cs="Arial"/>
+        </w:rPr>
+        <w:t xml:space="preserve"> coeficiente k: </w:t>
       </w:r>
       <w:r>
         <w:rPr>
@@ -535,7 +572,37 @@
         <w:rPr>
           <w:rFonts w:ascii="Arial" w:hAnsi="Arial" w:cs="Arial"/>
         </w:rPr>
-        <w:t>2.2.2 Obtener todos los coeficientes: O(</w:t>
+        <w:t xml:space="preserve">2.2.2 </w:t>
+      </w:r>
+      <w:r>
+        <w:rPr>
+          <w:rFonts w:ascii="Arial" w:hAnsi="Arial" w:cs="Arial"/>
+        </w:rPr>
+        <w:t>E</w:t>
+      </w:r>
+      <w:r>
+        <w:rPr>
+          <w:rFonts w:ascii="Arial" w:hAnsi="Arial" w:cs="Arial"/>
+        </w:rPr>
+        <w:t>xpandir</w:t>
+      </w:r>
+      <w:r>
+        <w:rPr>
+          <w:rFonts w:ascii="Arial" w:hAnsi="Arial" w:cs="Arial"/>
+        </w:rPr>
+        <w:t xml:space="preserve"> </w:t>
+      </w:r>
+      <w:r>
+        <w:rPr>
+          <w:rFonts w:ascii="Arial" w:hAnsi="Arial" w:cs="Arial"/>
+        </w:rPr>
+        <w:t>Binomio</w:t>
+      </w:r>
+      <w:r>
+        <w:rPr>
+          <w:rFonts w:ascii="Arial" w:hAnsi="Arial" w:cs="Arial"/>
+        </w:rPr>
+        <w:t>: O(</w:t>
       </w:r>
       <w:r>
         <w:rPr>
@@ -567,7 +634,57 @@
         <w:rPr>
           <w:rFonts w:ascii="Arial" w:hAnsi="Arial" w:cs="Arial"/>
         </w:rPr>
-        <w:t>2.2.2 Evaluar binomio: O(N)</w:t>
+        <w:t xml:space="preserve">2.2.2 </w:t>
+      </w:r>
+      <w:r>
+        <w:rPr>
+          <w:rFonts w:ascii="Arial" w:hAnsi="Arial" w:cs="Arial"/>
+        </w:rPr>
+        <w:t>R</w:t>
+      </w:r>
+      <w:r>
+        <w:rPr>
+          <w:rFonts w:ascii="Arial" w:hAnsi="Arial" w:cs="Arial"/>
+        </w:rPr>
+        <w:t>esolver</w:t>
+      </w:r>
+      <w:r>
+        <w:rPr>
+          <w:rFonts w:ascii="Arial" w:hAnsi="Arial" w:cs="Arial"/>
+        </w:rPr>
+        <w:t xml:space="preserve"> </w:t>
+      </w:r>
+      <w:r>
+        <w:rPr>
+          <w:rFonts w:ascii="Arial" w:hAnsi="Arial" w:cs="Arial"/>
+        </w:rPr>
+        <w:t>Binomio</w:t>
+      </w:r>
+      <w:r>
+        <w:rPr>
+          <w:rFonts w:ascii="Arial" w:hAnsi="Arial" w:cs="Arial"/>
+        </w:rPr>
+        <w:t xml:space="preserve">: </w:t>
+      </w:r>
+      <w:proofErr w:type="gramStart"/>
+      <w:r>
+        <w:rPr>
+          <w:rFonts w:ascii="Arial" w:hAnsi="Arial" w:cs="Arial"/>
+        </w:rPr>
+        <w:t>O(</w:t>
+      </w:r>
+      <w:proofErr w:type="gramEnd"/>
+      <w:r>
+        <w:rPr>
+          <w:rFonts w:ascii="Arial" w:hAnsi="Arial" w:cs="Arial"/>
+        </w:rPr>
+        <w:t>1</w:t>
+      </w:r>
+      <w:r>
+        <w:rPr>
+          <w:rFonts w:ascii="Arial" w:hAnsi="Arial" w:cs="Arial"/>
+        </w:rPr>
+        <w:t>)</w:t>
       </w:r>
     </w:p>
     <w:p>

</xml_diff>